<commit_message>
Simulation code iteration 1
</commit_message>
<xml_diff>
--- a/Project 4/Background/Project 4 Interim Analysis Plan.docx
+++ b/Project 4/Background/Project 4 Interim Analysis Plan.docx
@@ -77,7 +77,25 @@
         <w:rPr>
           <w:rFonts w:ascii="Arial" w:hAnsi="Arial" w:cs="Arial"/>
         </w:rPr>
-        <w:t xml:space="preserve"> In backward selection using F-tests and p-values, a threshold of 0.15 will be used for model significance. </w:t>
+        <w:t xml:space="preserve"> In backward selection using F-tests and p-values, a threshold of 0.</w:t>
+      </w:r>
+      <w:r>
+        <w:rPr>
+          <w:rFonts w:ascii="Arial" w:hAnsi="Arial" w:cs="Arial"/>
+        </w:rPr>
+        <w:t>0</w:t>
+      </w:r>
+      <w:r>
+        <w:rPr>
+          <w:rFonts w:ascii="Arial" w:hAnsi="Arial" w:cs="Arial"/>
+        </w:rPr>
+        <w:t>5</w:t>
+      </w:r>
+      <w:r>
+        <w:rPr>
+          <w:rFonts w:ascii="Arial" w:hAnsi="Arial" w:cs="Arial"/>
+        </w:rPr>
+        <w:t xml:space="preserve"> will be used for model significance. </w:t>
       </w:r>
       <w:r>
         <w:rPr>
@@ -161,7 +179,21 @@
         <w:rPr>
           <w:rFonts w:ascii="Arial" w:hAnsi="Arial" w:cs="Arial"/>
         </w:rPr>
-        <w:t xml:space="preserve">using the hdrm package in R with a set seed under </w:t>
+        <w:t xml:space="preserve">using the </w:t>
+      </w:r>
+      <w:proofErr w:type="spellStart"/>
+      <w:r>
+        <w:rPr>
+          <w:rFonts w:ascii="Arial" w:hAnsi="Arial" w:cs="Arial"/>
+        </w:rPr>
+        <w:t>hdrm</w:t>
+      </w:r>
+      <w:proofErr w:type="spellEnd"/>
+      <w:r>
+        <w:rPr>
+          <w:rFonts w:ascii="Arial" w:hAnsi="Arial" w:cs="Arial"/>
+        </w:rPr>
+        <w:t xml:space="preserve"> package in R with a set seed under </w:t>
       </w:r>
       <w:r>
         <w:rPr>
@@ -197,7 +229,19 @@
         <w:rPr>
           <w:rFonts w:ascii="Arial" w:hAnsi="Arial" w:cs="Arial"/>
         </w:rPr>
-        <w:t xml:space="preserve">Each scenario will be replicated 1,000 times. </w:t>
+        <w:t xml:space="preserve">Each scenario will be replicated </w:t>
+      </w:r>
+      <w:r>
+        <w:rPr>
+          <w:rFonts w:ascii="Arial" w:hAnsi="Arial" w:cs="Arial"/>
+        </w:rPr>
+        <w:t>2,500</w:t>
+      </w:r>
+      <w:r>
+        <w:rPr>
+          <w:rFonts w:ascii="Arial" w:hAnsi="Arial" w:cs="Arial"/>
+        </w:rPr>
+        <w:t xml:space="preserve"> times. </w:t>
       </w:r>
     </w:p>
     <w:p>
@@ -212,13 +256,7 @@
         <w:rPr>
           <w:rFonts w:ascii="Arial" w:hAnsi="Arial" w:cs="Arial"/>
         </w:rPr>
-        <w:t>Results will be summarized both in terms of overall characteristics of the simulation and at the individual simulated variable level. At the overall level, we will present the true positive rate (</w:t>
-      </w:r>
-      <w:r>
-        <w:rPr>
-          <w:rFonts w:ascii="Arial" w:hAnsi="Arial" w:cs="Arial"/>
-        </w:rPr>
-        <w:t>the proportion of the simulations in which the</w:t>
+        <w:t>Results will be summarized both in terms of overall characteristics of the simulation and at the individual simulated variable level. At the overall level, we will present the true positive rate (the proportion of the simulations in which the</w:t>
       </w:r>
       <w:r>
         <w:rPr>
@@ -230,13 +268,7 @@
         <w:rPr>
           <w:rFonts w:ascii="Arial" w:hAnsi="Arial" w:cs="Arial"/>
         </w:rPr>
-        <w:t xml:space="preserve"> predictors with a true effect are included in the final model</w:t>
-      </w:r>
-      <w:r>
-        <w:rPr>
-          <w:rFonts w:ascii="Arial" w:hAnsi="Arial" w:cs="Arial"/>
-        </w:rPr>
-        <w:t xml:space="preserve">) and false positive rate (the proportion of simulations in which the </w:t>
+        <w:t xml:space="preserve"> predictors with a true effect are included in the final model) and false positive rate (the proportion of simulations in which the </w:t>
       </w:r>
       <w:r>
         <w:rPr>
@@ -248,7 +280,31 @@
         <w:rPr>
           <w:rFonts w:ascii="Arial" w:hAnsi="Arial" w:cs="Arial"/>
         </w:rPr>
-        <w:t xml:space="preserve">predictors without a true effect are included in the model) across the 1,000 simulations for each scenario. At the individual variable </w:t>
+        <w:t xml:space="preserve">predictors without a true effect are included in the model) across the </w:t>
+      </w:r>
+      <w:r>
+        <w:rPr>
+          <w:rFonts w:ascii="Arial" w:hAnsi="Arial" w:cs="Arial"/>
+        </w:rPr>
+        <w:t>2</w:t>
+      </w:r>
+      <w:r>
+        <w:rPr>
+          <w:rFonts w:ascii="Arial" w:hAnsi="Arial" w:cs="Arial"/>
+        </w:rPr>
+        <w:t>,</w:t>
+      </w:r>
+      <w:r>
+        <w:rPr>
+          <w:rFonts w:ascii="Arial" w:hAnsi="Arial" w:cs="Arial"/>
+        </w:rPr>
+        <w:t>5</w:t>
+      </w:r>
+      <w:r>
+        <w:rPr>
+          <w:rFonts w:ascii="Arial" w:hAnsi="Arial" w:cs="Arial"/>
+        </w:rPr>
+        <w:t xml:space="preserve">00 simulations for each scenario. At the individual variable </w:t>
       </w:r>
       <w:r>
         <w:rPr>

</xml_diff>